<commit_message>
update lesson docx template
</commit_message>
<xml_diff>
--- a/templates/lesson_template.docx
+++ b/templates/lesson_template.docx
@@ -497,69 +497,11 @@
             <w:r>
               <w:rPr>
                 <w:rFonts w:ascii="Times New Roman" w:eastAsia="仿宋_GB2312" w:hAnsi="Times New Roman"/>
-                <w:noProof/>
                 <w:color w:val="0D0D0D" w:themeColor="text1" w:themeTint="F2"/>
                 <w:sz w:val="24"/>
                 <w:lang w:bidi="ar"/>
               </w:rPr>
               <w:lastRenderedPageBreak/>
-              <w:drawing>
-                <wp:anchor distT="0" distB="0" distL="114300" distR="114300" simplePos="0" relativeHeight="251659264" behindDoc="0" locked="0" layoutInCell="1" allowOverlap="1" wp14:anchorId="38004BD7" wp14:editId="7E6A5909">
-                  <wp:simplePos x="0" y="0"/>
-                  <wp:positionH relativeFrom="column">
-                    <wp:posOffset>-842010</wp:posOffset>
-                  </wp:positionH>
-                  <wp:positionV relativeFrom="paragraph">
-                    <wp:posOffset>530860</wp:posOffset>
-                  </wp:positionV>
-                  <wp:extent cx="342265" cy="4971415"/>
-                  <wp:effectExtent l="0" t="0" r="635" b="635"/>
-                  <wp:wrapNone/>
-                  <wp:docPr id="7" name="图片 1"/>
-                  <wp:cNvGraphicFramePr>
-                    <a:graphicFrameLocks xmlns:a="http://schemas.openxmlformats.org/drawingml/2006/main" noChangeAspect="1"/>
-                  </wp:cNvGraphicFramePr>
-                  <a:graphic xmlns:a="http://schemas.openxmlformats.org/drawingml/2006/main">
-                    <a:graphicData uri="http://schemas.openxmlformats.org/drawingml/2006/picture">
-                      <pic:pic xmlns:pic="http://schemas.openxmlformats.org/drawingml/2006/picture">
-                        <pic:nvPicPr>
-                          <pic:cNvPr id="7" name="图片 1"/>
-                          <pic:cNvPicPr>
-                            <a:picLocks noChangeAspect="1"/>
-                          </pic:cNvPicPr>
-                        </pic:nvPicPr>
-                        <pic:blipFill>
-                          <a:blip r:embed="rId4"/>
-                          <a:stretch>
-                            <a:fillRect/>
-                          </a:stretch>
-                        </pic:blipFill>
-                        <pic:spPr>
-                          <a:xfrm>
-                            <a:off x="0" y="0"/>
-                            <a:ext cx="342265" cy="4971415"/>
-                          </a:xfrm>
-                          <a:prstGeom prst="rect">
-                            <a:avLst/>
-                          </a:prstGeom>
-                          <a:noFill/>
-                          <a:ln>
-                            <a:noFill/>
-                          </a:ln>
-                        </pic:spPr>
-                      </pic:pic>
-                    </a:graphicData>
-                  </a:graphic>
-                </wp:anchor>
-              </w:drawing>
-            </w:r>
-            <w:r>
-              <w:rPr>
-                <w:rFonts w:ascii="Times New Roman" w:eastAsia="仿宋_GB2312" w:hAnsi="Times New Roman"/>
-                <w:color w:val="0D0D0D" w:themeColor="text1" w:themeTint="F2"/>
-                <w:sz w:val="24"/>
-                <w:lang w:bidi="ar"/>
-              </w:rPr>
               <w:t>授课班级</w:t>
             </w:r>
           </w:p>

</xml_diff>